<commit_message>
Write KNN results into project report
</commit_message>
<xml_diff>
--- a/Machine Learning Project - Group 7.docx
+++ b/Machine Learning Project - Group 7.docx
@@ -15839,11 +15839,219 @@
         </w:rPr>
       </w:pPr>
       <w:r>
-        <w:rPr>
-          <w:rtl w:val="0"/>
-        </w:rPr>
-      </w:r>
-    </w:p>
+        <w:t>For the KNN model, a simple hyperparameter search was carried out by testing several values of the number of neighbors (k) on both the original feature set and the PCA-reduced feature set. The evaluation again used 5-fold cross-validation with Macro F1-score as the main selection criterion so that all 114 genre classes were weighted equally. In this notebook, the distance metric and weighting scheme were kept at the default sklearn settings (Minkowski distance with uniform weights), while k was varied across 3, 5, 7, and 9.</w:t>
+      </w:r>
+    </w:p>
+    <w:p>
+      <w:r>
+        <w:t>When the model was trained on the original features, performance improved steadily as k increased. The best result on the original feature space was obtained at k = 9, with a cross-validation Macro F1-score of 0.1991, test accuracy of 0.2120, and test Macro F1-score of 0.2051.</w:t>
+      </w:r>
+    </w:p>
+    <w:p>
+      <w:r>
+        <w:t>The PCA-based version performed better at every tested value of k. The best overall KNN result was achieved with PCA features and k = 9, which produced a cross-validation Macro F1-score of 0.2210, test accuracy of 0.2315, and test Macro F1-score of 0.2240. This indicates that PCA helped KNN by reducing redundancy in the feature space and making distance comparisons between tracks more meaningful.</w:t>
+      </w:r>
+    </w:p>
+    <w:p>
+      <w:r>
+        <w:t>Comprehensive Performance Evaluation</w:t>
+      </w:r>
+    </w:p>
+    <w:p>
+      <w:r>
+        <w:t>The final optimized KNN model was therefore the PCA-based model with k = 9. The following table compares the best model from each feature representation.</w:t>
+      </w:r>
+    </w:p>
+    <w:tbl>
+      <w:tblPr>
+        <w:tblW w:type="auto" w:w="0"/>
+        <w:tblLook w:firstColumn="1" w:firstRow="1" w:lastColumn="0" w:lastRow="0" w:noHBand="0" w:noVBand="1" w:val="04A0"/>
+      </w:tblPr>
+      <w:tblGrid>
+        <w:gridCol w:w="1872"/>
+        <w:gridCol w:w="1872"/>
+        <w:gridCol w:w="1872"/>
+        <w:gridCol w:w="1872"/>
+        <w:gridCol w:w="1872"/>
+      </w:tblGrid>
+      <w:tr>
+        <w:tc>
+          <w:tcPr>
+            <w:tcW w:type="dxa" w:w="1872"/>
+          </w:tcPr>
+          <w:p>
+            <w:r>
+              <w:rPr>
+                <w:b/>
+              </w:rPr>
+              <w:t>Feature Set</w:t>
+            </w:r>
+          </w:p>
+        </w:tc>
+        <w:tc>
+          <w:tcPr>
+            <w:tcW w:type="dxa" w:w="1872"/>
+          </w:tcPr>
+          <w:p>
+            <w:r>
+              <w:rPr>
+                <w:b/>
+              </w:rPr>
+              <w:t>Best k</w:t>
+            </w:r>
+          </w:p>
+        </w:tc>
+        <w:tc>
+          <w:tcPr>
+            <w:tcW w:type="dxa" w:w="1872"/>
+          </w:tcPr>
+          <w:p>
+            <w:r>
+              <w:rPr>
+                <w:b/>
+              </w:rPr>
+              <w:t>CV Macro F1</w:t>
+            </w:r>
+          </w:p>
+        </w:tc>
+        <w:tc>
+          <w:tcPr>
+            <w:tcW w:type="dxa" w:w="1872"/>
+          </w:tcPr>
+          <w:p>
+            <w:r>
+              <w:rPr>
+                <w:b/>
+              </w:rPr>
+              <w:t>Test Accuracy</w:t>
+            </w:r>
+          </w:p>
+        </w:tc>
+        <w:tc>
+          <w:tcPr>
+            <w:tcW w:type="dxa" w:w="1872"/>
+          </w:tcPr>
+          <w:p>
+            <w:r>
+              <w:rPr>
+                <w:b/>
+              </w:rPr>
+              <w:t>Test Macro F1</w:t>
+            </w:r>
+          </w:p>
+        </w:tc>
+      </w:tr>
+      <w:tr>
+        <w:tc>
+          <w:tcPr>
+            <w:tcW w:type="dxa" w:w="1872"/>
+          </w:tcPr>
+          <w:p>
+            <w:r>
+              <w:t>Original Features</w:t>
+            </w:r>
+          </w:p>
+        </w:tc>
+        <w:tc>
+          <w:tcPr>
+            <w:tcW w:type="dxa" w:w="1872"/>
+          </w:tcPr>
+          <w:p>
+            <w:r>
+              <w:t>9</w:t>
+            </w:r>
+          </w:p>
+        </w:tc>
+        <w:tc>
+          <w:tcPr>
+            <w:tcW w:type="dxa" w:w="1872"/>
+          </w:tcPr>
+          <w:p>
+            <w:r>
+              <w:t>0.1991</w:t>
+            </w:r>
+          </w:p>
+        </w:tc>
+        <w:tc>
+          <w:tcPr>
+            <w:tcW w:type="dxa" w:w="1872"/>
+          </w:tcPr>
+          <w:p>
+            <w:r>
+              <w:t>0.2120</w:t>
+            </w:r>
+          </w:p>
+        </w:tc>
+        <w:tc>
+          <w:tcPr>
+            <w:tcW w:type="dxa" w:w="1872"/>
+          </w:tcPr>
+          <w:p>
+            <w:r>
+              <w:t>0.2051</w:t>
+            </w:r>
+          </w:p>
+        </w:tc>
+      </w:tr>
+      <w:tr>
+        <w:tc>
+          <w:tcPr>
+            <w:tcW w:type="dxa" w:w="1872"/>
+          </w:tcPr>
+          <w:p>
+            <w:r>
+              <w:t>PCA Features</w:t>
+            </w:r>
+          </w:p>
+        </w:tc>
+        <w:tc>
+          <w:tcPr>
+            <w:tcW w:type="dxa" w:w="1872"/>
+          </w:tcPr>
+          <w:p>
+            <w:r>
+              <w:t>9</w:t>
+            </w:r>
+          </w:p>
+        </w:tc>
+        <w:tc>
+          <w:tcPr>
+            <w:tcW w:type="dxa" w:w="1872"/>
+          </w:tcPr>
+          <w:p>
+            <w:r>
+              <w:t>0.2210</w:t>
+            </w:r>
+          </w:p>
+        </w:tc>
+        <w:tc>
+          <w:tcPr>
+            <w:tcW w:type="dxa" w:w="1872"/>
+          </w:tcPr>
+          <w:p>
+            <w:r>
+              <w:t>0.2315</w:t>
+            </w:r>
+          </w:p>
+        </w:tc>
+        <w:tc>
+          <w:tcPr>
+            <w:tcW w:type="dxa" w:w="1872"/>
+          </w:tcPr>
+          <w:p>
+            <w:r>
+              <w:t>0.2240</w:t>
+            </w:r>
+          </w:p>
+        </w:tc>
+      </w:tr>
+    </w:tbl>
+    <w:p>
+      <w:r>
+        <w:t>Based on the classification report of the best model, the final PCA-based KNN achieved an accuracy of 0.2315, with macro precision = 0.23, macro recall = 0.23, and macro F1-score = 0.22 on the unseen test set. The confusion matrix showed that some genres were recognized more reliably than others, while several classes with similar audio patterns were still confused with one another. Compared with the original feature space, PCA clearly improved the KNN model, which makes sense because KNN relies directly on distance calculations. Overall, the model performed far above the random baseline of approximately 0.0088 (1/114), but the results also show how difficult 114-class genre classification remains when many genres overlap in their high-level Spotify features.</w:t>
+      </w:r>
+    </w:p>
+    <w:p/>
     <w:p>
       <w:pPr>
         <w:numPr>

</xml_diff>

<commit_message>
Add discussion section to project report
</commit_message>
<xml_diff>
--- a/Machine Learning Project - Group 7.docx
+++ b/Machine Learning Project - Group 7.docx
@@ -19478,9 +19478,7 @@
         </w:rPr>
       </w:pPr>
       <w:r>
-        <w:rPr>
-          <w:rtl w:val="0"/>
-        </w:rPr>
+        <w:t>The table below summarizes the best result achieved by each algorithm on the original feature set and on the PCA-reduced feature set. Overall, the optimized Decision Tree trained on the original features gave the best performance in the project, while KNN benefited the most from PCA.</w:t>
       </w:r>
     </w:p>
     <w:p>
@@ -19496,12 +19494,327 @@
           <w:szCs w:val="24"/>
         </w:rPr>
       </w:pPr>
-      <w:r>
-        <w:rPr>
-          <w:rtl w:val="0"/>
-        </w:rPr>
-      </w:r>
-    </w:p>
+      <w:r/>
+    </w:p>
+    <w:tbl>
+      <w:tblPr>
+        <w:tblW w:type="auto" w:w="0"/>
+        <w:tblLook w:firstColumn="1" w:firstRow="1" w:lastColumn="0" w:lastRow="0" w:noHBand="0" w:noVBand="1" w:val="04A0"/>
+      </w:tblPr>
+      <w:tblGrid>
+        <w:gridCol w:w="1337"/>
+        <w:gridCol w:w="1337"/>
+        <w:gridCol w:w="1337"/>
+        <w:gridCol w:w="1337"/>
+        <w:gridCol w:w="1337"/>
+        <w:gridCol w:w="1337"/>
+        <w:gridCol w:w="1337"/>
+      </w:tblGrid>
+      <w:tr>
+        <w:tc>
+          <w:tcPr>
+            <w:tcW w:type="dxa" w:w="1337"/>
+          </w:tcPr>
+          <w:p>
+            <w:r>
+              <w:t>Algorithm</w:t>
+            </w:r>
+          </w:p>
+        </w:tc>
+        <w:tc>
+          <w:tcPr>
+            <w:tcW w:type="dxa" w:w="1337"/>
+          </w:tcPr>
+          <w:p>
+            <w:r>
+              <w:t>Best Original Setting</w:t>
+            </w:r>
+          </w:p>
+        </w:tc>
+        <w:tc>
+          <w:tcPr>
+            <w:tcW w:type="dxa" w:w="1337"/>
+          </w:tcPr>
+          <w:p>
+            <w:r>
+              <w:t>Original Accuracy</w:t>
+            </w:r>
+          </w:p>
+        </w:tc>
+        <w:tc>
+          <w:tcPr>
+            <w:tcW w:type="dxa" w:w="1337"/>
+          </w:tcPr>
+          <w:p>
+            <w:r>
+              <w:t>Original Macro F1</w:t>
+            </w:r>
+          </w:p>
+        </w:tc>
+        <w:tc>
+          <w:tcPr>
+            <w:tcW w:type="dxa" w:w="1337"/>
+          </w:tcPr>
+          <w:p>
+            <w:r>
+              <w:t>Best PCA Setting</w:t>
+            </w:r>
+          </w:p>
+        </w:tc>
+        <w:tc>
+          <w:tcPr>
+            <w:tcW w:type="dxa" w:w="1337"/>
+          </w:tcPr>
+          <w:p>
+            <w:r>
+              <w:t>PCA Accuracy</w:t>
+            </w:r>
+          </w:p>
+        </w:tc>
+        <w:tc>
+          <w:tcPr>
+            <w:tcW w:type="dxa" w:w="1337"/>
+          </w:tcPr>
+          <w:p>
+            <w:r>
+              <w:t>PCA Macro F1</w:t>
+            </w:r>
+          </w:p>
+        </w:tc>
+      </w:tr>
+      <w:tr>
+        <w:tc>
+          <w:tcPr>
+            <w:tcW w:type="dxa" w:w="1337"/>
+          </w:tcPr>
+          <w:p>
+            <w:r>
+              <w:t>Decision Tree</w:t>
+            </w:r>
+          </w:p>
+        </w:tc>
+        <w:tc>
+          <w:tcPr>
+            <w:tcW w:type="dxa" w:w="1337"/>
+          </w:tcPr>
+          <w:p>
+            <w:r>
+              <w:t>Optimized tree</w:t>
+            </w:r>
+          </w:p>
+        </w:tc>
+        <w:tc>
+          <w:tcPr>
+            <w:tcW w:type="dxa" w:w="1337"/>
+          </w:tcPr>
+          <w:p>
+            <w:r>
+              <w:t>0.2570</w:t>
+            </w:r>
+          </w:p>
+        </w:tc>
+        <w:tc>
+          <w:tcPr>
+            <w:tcW w:type="dxa" w:w="1337"/>
+          </w:tcPr>
+          <w:p>
+            <w:r>
+              <w:t>0.25</w:t>
+            </w:r>
+          </w:p>
+        </w:tc>
+        <w:tc>
+          <w:tcPr>
+            <w:tcW w:type="dxa" w:w="1337"/>
+          </w:tcPr>
+          <w:p>
+            <w:r>
+              <w:t>Optimized tree</w:t>
+            </w:r>
+          </w:p>
+        </w:tc>
+        <w:tc>
+          <w:tcPr>
+            <w:tcW w:type="dxa" w:w="1337"/>
+          </w:tcPr>
+          <w:p>
+            <w:r>
+              <w:t>0.1928</w:t>
+            </w:r>
+          </w:p>
+        </w:tc>
+        <w:tc>
+          <w:tcPr>
+            <w:tcW w:type="dxa" w:w="1337"/>
+          </w:tcPr>
+          <w:p>
+            <w:r>
+              <w:t>0.18</w:t>
+            </w:r>
+          </w:p>
+        </w:tc>
+      </w:tr>
+      <w:tr>
+        <w:tc>
+          <w:tcPr>
+            <w:tcW w:type="dxa" w:w="1337"/>
+          </w:tcPr>
+          <w:p>
+            <w:r>
+              <w:t>KNN</w:t>
+            </w:r>
+          </w:p>
+        </w:tc>
+        <w:tc>
+          <w:tcPr>
+            <w:tcW w:type="dxa" w:w="1337"/>
+          </w:tcPr>
+          <w:p>
+            <w:r>
+              <w:t>k = 9</w:t>
+            </w:r>
+          </w:p>
+        </w:tc>
+        <w:tc>
+          <w:tcPr>
+            <w:tcW w:type="dxa" w:w="1337"/>
+          </w:tcPr>
+          <w:p>
+            <w:r>
+              <w:t>0.2120</w:t>
+            </w:r>
+          </w:p>
+        </w:tc>
+        <w:tc>
+          <w:tcPr>
+            <w:tcW w:type="dxa" w:w="1337"/>
+          </w:tcPr>
+          <w:p>
+            <w:r>
+              <w:t>0.2051</w:t>
+            </w:r>
+          </w:p>
+        </w:tc>
+        <w:tc>
+          <w:tcPr>
+            <w:tcW w:type="dxa" w:w="1337"/>
+          </w:tcPr>
+          <w:p>
+            <w:r>
+              <w:t>k = 9</w:t>
+            </w:r>
+          </w:p>
+        </w:tc>
+        <w:tc>
+          <w:tcPr>
+            <w:tcW w:type="dxa" w:w="1337"/>
+          </w:tcPr>
+          <w:p>
+            <w:r>
+              <w:t>0.2315</w:t>
+            </w:r>
+          </w:p>
+        </w:tc>
+        <w:tc>
+          <w:tcPr>
+            <w:tcW w:type="dxa" w:w="1337"/>
+          </w:tcPr>
+          <w:p>
+            <w:r>
+              <w:t>0.2240</w:t>
+            </w:r>
+          </w:p>
+        </w:tc>
+      </w:tr>
+      <w:tr>
+        <w:tc>
+          <w:tcPr>
+            <w:tcW w:type="dxa" w:w="1337"/>
+          </w:tcPr>
+          <w:p>
+            <w:r>
+              <w:t>Naive Bayes</w:t>
+            </w:r>
+          </w:p>
+        </w:tc>
+        <w:tc>
+          <w:tcPr>
+            <w:tcW w:type="dxa" w:w="1337"/>
+          </w:tcPr>
+          <w:p>
+            <w:r>
+              <w:t>Bernoulli NB</w:t>
+            </w:r>
+          </w:p>
+        </w:tc>
+        <w:tc>
+          <w:tcPr>
+            <w:tcW w:type="dxa" w:w="1337"/>
+          </w:tcPr>
+          <w:p>
+            <w:r>
+              <w:t>0.1486</w:t>
+            </w:r>
+          </w:p>
+        </w:tc>
+        <w:tc>
+          <w:tcPr>
+            <w:tcW w:type="dxa" w:w="1337"/>
+          </w:tcPr>
+          <w:p>
+            <w:r>
+              <w:t>0.1163</w:t>
+            </w:r>
+          </w:p>
+        </w:tc>
+        <w:tc>
+          <w:tcPr>
+            <w:tcW w:type="dxa" w:w="1337"/>
+          </w:tcPr>
+          <w:p>
+            <w:r>
+              <w:t>Gaussian NB</w:t>
+            </w:r>
+          </w:p>
+        </w:tc>
+        <w:tc>
+          <w:tcPr>
+            <w:tcW w:type="dxa" w:w="1337"/>
+          </w:tcPr>
+          <w:p>
+            <w:r>
+              <w:t>0.1779</w:t>
+            </w:r>
+          </w:p>
+        </w:tc>
+        <w:tc>
+          <w:tcPr>
+            <w:tcW w:type="dxa" w:w="1337"/>
+          </w:tcPr>
+          <w:p>
+            <w:r>
+              <w:t>0.1422</w:t>
+            </w:r>
+          </w:p>
+        </w:tc>
+      </w:tr>
+    </w:tbl>
+    <w:p>
+      <w:r>
+        <w:t>The clearest pattern in the results is that PCA did not affect every algorithm in the same way. Decision Tree performed best on the original features, with accuracy = 0.2570 and macro F1-score = 0.25, while its PCA version dropped to 0.1928 accuracy and 0.18 macro F1-score. In contrast, KNN improved from 0.2120 accuracy and 0.2051 macro F1-score on the original features to 0.2315 accuracy and 0.2240 macro F1-score after PCA. Naive Bayes also benefited from dimensionality reduction, with Gaussian Naive Bayes on PCA features reaching 0.1779 accuracy and 0.1422 macro F1-score, which was clearly better than the other Naive Bayes variants. This suggests that PCA was most helpful for the distance-based and probabilistic models, but not for the tree model, which could use the original feature space more effectively.</w:t>
+      </w:r>
+    </w:p>
+    <w:p>
+      <w:r>
+        <w:t>These findings partially agree with the literature review. Section 2 noted that tree-based methods were generally stronger than KNN and Naive Bayes, especially in [7], and our results follow the same overall pattern because the Decision Tree achieved the best performance of the three algorithms. Unlike the feature-reduction result discussed in [6], however, reducing the feature space did not help every model in our notebook. Our absolute scores were also much lower than the values reported in [7]. A likely reason is that our task is more difficult: the notebook uses 114 balanced genres, so the classifier has to separate many classes with overlapping audio characteristics. This is very different from smaller-genre settings or studies that do not fully document preprocessing and evaluation details.</w:t>
+      </w:r>
+    </w:p>
+    <w:p>
+      <w:r>
+        <w:t>Another important point is that the high-level Spotify features were useful, but they were not enough to separate all genres cleanly. All three models performed far above the random baseline of about 0.0088, so the features do carry meaningful genre information. However, the classification reports and confusion matrices show that some genres were still mixed together because many classes share similar values for features such as danceability, energy, loudness, and valence. From a practical point of view, the best overall model in this project was the tuned Decision Tree on the original features, while the best PCA-based model was KNN with k = 9. A limitation of the current KNN experiment is that only k was tuned in the notebook, while the distance metric and weights remained at their default settings, so there is still room for improvement in future work.</w:t>
+      </w:r>
+    </w:p>
+    <w:p/>
     <w:p>
       <w:pPr>
         <w:numPr>

</xml_diff>